<commit_message>
Ap dung le chuan HUTECH va them huong dan chay tren may local
Le theo thong so pho bien cua sinh vien HUTECH:
  Tren 2,0cm · Duoi 2,0cm · Trai 3,0cm · Phai 2,0cm
Quy doi DXA (1 inch = 2,54cm = 1440 DXA): 2,0cm = 1134 · 3,0cm = 1701
Vung noi dung rong them: CW 8846 -> 9071 DXA

So trang giam do le rong hon:
  Bao cao ket qua 26 -> 25 · Bao cao EDA 21 -> 19
  Giao trinh      28 -> 24 · Tap bai tap  37 -> 32

Muc luc bi lech theo nen da do lai tu dong tu ban PDF va kiem chung
lai toan bo: 118/118 muc khop dung trang that.

Dong goi de chay duoc tren may khac:
- Chep kem thu muc img/ (logo + bieu do) vao tung thu muc ma nguon
- Moi generator dung __dirname, khong con duong dan tuyet doi

Them CHAY_TREN_MAY_LOCAL.md: cach clone, cai dat, lenh dung lai tung
tai lieu, vi tri sua noi dung, va cach do lai so trang muc luc sau khi sua.

Co-Authored-By: Claude Opus 5 <noreply@anthropic.com>
Claude-Session: https://claude.ai/code/session_01Xzt8sWXNwvk3B3ie7C6JVc
</commit_message>
<xml_diff>
--- a/BaiTap_PhanTichTamLyHoc/BaoCao_EDA_StudentDepression.docx
+++ b/BaiTap_PhanTichTamLyHoc/BaoCao_EDA_StudentDepression.docx
@@ -4,7 +4,7 @@
   <w:body>
     <w:tbl>
       <w:tblPr>
-        <w:tblW w:type="dxa" w:w="8906"/>
+        <w:tblW w:type="dxa" w:w="9071"/>
         <w:tblBorders>
           <w:top w:val="single" w:color="auto" w:sz="4"/>
           <w:left w:val="single" w:color="auto" w:sz="4"/>
@@ -15,13 +15,13 @@
         </w:tblBorders>
       </w:tblPr>
       <w:tblGrid>
-        <w:gridCol w:w="3562"/>
-        <w:gridCol w:w="5344"/>
+        <w:gridCol w:w="3628"/>
+        <w:gridCol w:w="5443"/>
       </w:tblGrid>
       <w:tr>
         <w:tc>
           <w:tcPr>
-            <w:tcW w:type="dxa" w:w="3562"/>
+            <w:tcW w:type="dxa" w:w="3628"/>
             <w:tcBorders>
               <w:top w:val="none" w:color="FFFFFF" w:sz="0"/>
               <w:left w:val="none" w:color="FFFFFF" w:sz="0"/>
@@ -85,7 +85,7 @@
         </w:tc>
         <w:tc>
           <w:tcPr>
-            <w:tcW w:type="dxa" w:w="5344"/>
+            <w:tcW w:type="dxa" w:w="5443"/>
             <w:tcBorders>
               <w:top w:val="none" w:color="FFFFFF" w:sz="0"/>
               <w:left w:val="none" w:color="FFFFFF" w:sz="0"/>
@@ -274,7 +274,7 @@
     </w:p>
     <w:tbl>
       <w:tblPr>
-        <w:tblW w:type="dxa" w:w="8906"/>
+        <w:tblW w:type="dxa" w:w="9071"/>
         <w:tblBorders>
           <w:top w:val="single" w:color="auto" w:sz="4"/>
           <w:left w:val="single" w:color="auto" w:sz="4"/>
@@ -285,9 +285,9 @@
         </w:tblBorders>
       </w:tblPr>
       <w:tblGrid>
-        <w:gridCol w:w="3919"/>
-        <w:gridCol w:w="2494"/>
-        <w:gridCol w:w="2493"/>
+        <w:gridCol w:w="3991"/>
+        <w:gridCol w:w="2540"/>
+        <w:gridCol w:w="2540"/>
       </w:tblGrid>
       <w:tr>
         <w:trPr>
@@ -296,7 +296,7 @@
         </w:trPr>
         <w:tc>
           <w:tcPr>
-            <w:tcW w:type="dxa" w:w="3919"/>
+            <w:tcW w:type="dxa" w:w="3991"/>
             <w:tcBorders>
               <w:top w:val="single" w:color="000000" w:sz="8"/>
               <w:left w:val="single" w:color="000000" w:sz="8"/>
@@ -330,7 +330,7 @@
         </w:tc>
         <w:tc>
           <w:tcPr>
-            <w:tcW w:type="dxa" w:w="2494"/>
+            <w:tcW w:type="dxa" w:w="2540"/>
             <w:tcBorders>
               <w:top w:val="single" w:color="000000" w:sz="8"/>
               <w:left w:val="single" w:color="000000" w:sz="8"/>
@@ -364,7 +364,7 @@
         </w:tc>
         <w:tc>
           <w:tcPr>
-            <w:tcW w:type="dxa" w:w="2493"/>
+            <w:tcW w:type="dxa" w:w="2540"/>
             <w:tcBorders>
               <w:top w:val="single" w:color="000000" w:sz="8"/>
               <w:left w:val="single" w:color="000000" w:sz="8"/>
@@ -403,7 +403,7 @@
         </w:trPr>
         <w:tc>
           <w:tcPr>
-            <w:tcW w:type="dxa" w:w="3919"/>
+            <w:tcW w:type="dxa" w:w="3991"/>
             <w:tcBorders>
               <w:top w:val="single" w:color="000000" w:sz="8"/>
               <w:left w:val="single" w:color="000000" w:sz="8"/>
@@ -437,7 +437,7 @@
         </w:tc>
         <w:tc>
           <w:tcPr>
-            <w:tcW w:type="dxa" w:w="2494"/>
+            <w:tcW w:type="dxa" w:w="2540"/>
             <w:tcBorders>
               <w:top w:val="single" w:color="000000" w:sz="8"/>
               <w:left w:val="single" w:color="000000" w:sz="8"/>
@@ -471,7 +471,7 @@
         </w:tc>
         <w:tc>
           <w:tcPr>
-            <w:tcW w:type="dxa" w:w="2493"/>
+            <w:tcW w:type="dxa" w:w="2540"/>
             <w:tcBorders>
               <w:top w:val="single" w:color="000000" w:sz="8"/>
               <w:left w:val="single" w:color="000000" w:sz="8"/>
@@ -510,7 +510,7 @@
         </w:trPr>
         <w:tc>
           <w:tcPr>
-            <w:tcW w:type="dxa" w:w="3919"/>
+            <w:tcW w:type="dxa" w:w="3991"/>
             <w:tcBorders>
               <w:top w:val="single" w:color="000000" w:sz="8"/>
               <w:left w:val="single" w:color="000000" w:sz="8"/>
@@ -544,7 +544,7 @@
         </w:tc>
         <w:tc>
           <w:tcPr>
-            <w:tcW w:type="dxa" w:w="2494"/>
+            <w:tcW w:type="dxa" w:w="2540"/>
             <w:tcBorders>
               <w:top w:val="single" w:color="000000" w:sz="8"/>
               <w:left w:val="single" w:color="000000" w:sz="8"/>
@@ -578,7 +578,7 @@
         </w:tc>
         <w:tc>
           <w:tcPr>
-            <w:tcW w:type="dxa" w:w="2493"/>
+            <w:tcW w:type="dxa" w:w="2540"/>
             <w:tcBorders>
               <w:top w:val="single" w:color="000000" w:sz="8"/>
               <w:left w:val="single" w:color="000000" w:sz="8"/>
@@ -617,7 +617,7 @@
         </w:trPr>
         <w:tc>
           <w:tcPr>
-            <w:tcW w:type="dxa" w:w="3919"/>
+            <w:tcW w:type="dxa" w:w="3991"/>
             <w:tcBorders>
               <w:top w:val="single" w:color="000000" w:sz="8"/>
               <w:left w:val="single" w:color="000000" w:sz="8"/>
@@ -651,7 +651,7 @@
         </w:tc>
         <w:tc>
           <w:tcPr>
-            <w:tcW w:type="dxa" w:w="2494"/>
+            <w:tcW w:type="dxa" w:w="2540"/>
             <w:tcBorders>
               <w:top w:val="single" w:color="000000" w:sz="8"/>
               <w:left w:val="single" w:color="000000" w:sz="8"/>
@@ -685,7 +685,7 @@
         </w:tc>
         <w:tc>
           <w:tcPr>
-            <w:tcW w:type="dxa" w:w="2493"/>
+            <w:tcW w:type="dxa" w:w="2540"/>
             <w:tcBorders>
               <w:top w:val="single" w:color="000000" w:sz="8"/>
               <w:left w:val="single" w:color="000000" w:sz="8"/>
@@ -724,7 +724,7 @@
         </w:trPr>
         <w:tc>
           <w:tcPr>
-            <w:tcW w:type="dxa" w:w="3919"/>
+            <w:tcW w:type="dxa" w:w="3991"/>
             <w:tcBorders>
               <w:top w:val="single" w:color="000000" w:sz="8"/>
               <w:left w:val="single" w:color="000000" w:sz="8"/>
@@ -758,7 +758,7 @@
         </w:tc>
         <w:tc>
           <w:tcPr>
-            <w:tcW w:type="dxa" w:w="2494"/>
+            <w:tcW w:type="dxa" w:w="2540"/>
             <w:tcBorders>
               <w:top w:val="single" w:color="000000" w:sz="8"/>
               <w:left w:val="single" w:color="000000" w:sz="8"/>
@@ -792,7 +792,7 @@
         </w:tc>
         <w:tc>
           <w:tcPr>
-            <w:tcW w:type="dxa" w:w="2493"/>
+            <w:tcW w:type="dxa" w:w="2540"/>
             <w:tcBorders>
               <w:top w:val="single" w:color="000000" w:sz="8"/>
               <w:left w:val="single" w:color="000000" w:sz="8"/>
@@ -831,7 +831,7 @@
         </w:trPr>
         <w:tc>
           <w:tcPr>
-            <w:tcW w:type="dxa" w:w="3919"/>
+            <w:tcW w:type="dxa" w:w="3991"/>
             <w:tcBorders>
               <w:top w:val="single" w:color="000000" w:sz="8"/>
               <w:left w:val="single" w:color="000000" w:sz="8"/>
@@ -865,7 +865,7 @@
         </w:tc>
         <w:tc>
           <w:tcPr>
-            <w:tcW w:type="dxa" w:w="2494"/>
+            <w:tcW w:type="dxa" w:w="2540"/>
             <w:tcBorders>
               <w:top w:val="single" w:color="000000" w:sz="8"/>
               <w:left w:val="single" w:color="000000" w:sz="8"/>
@@ -899,7 +899,7 @@
         </w:tc>
         <w:tc>
           <w:tcPr>
-            <w:tcW w:type="dxa" w:w="2493"/>
+            <w:tcW w:type="dxa" w:w="2540"/>
             <w:tcBorders>
               <w:top w:val="single" w:color="000000" w:sz="8"/>
               <w:left w:val="single" w:color="000000" w:sz="8"/>
@@ -958,7 +958,7 @@
       <w:pPr>
         <w:sectPr>
           <w:pgSz w:w="11906" w:h="16838" w:orient="portrait"/>
-          <w:pgMar w:top="1300" w:right="1300" w:bottom="1300" w:left="1700" w:header="708" w:footer="708" w:gutter="0"/>
+          <w:pgMar w:top="1134" w:right="1134" w:bottom="1134" w:left="1701" w:header="708" w:footer="708" w:gutter="0"/>
           <w:pgBorders>
             <w:top w:val="double" w:color="000000" w:sz="18" w:space="22"/>
             <w:left w:val="double" w:color="000000" w:sz="18" w:space="22"/>
@@ -993,7 +993,7 @@
     <w:p>
       <w:pPr>
         <w:tabs>
-          <w:tab w:val="right" w:pos="8646" w:leader="dot"/>
+          <w:tab w:val="right" w:pos="8871" w:leader="dot"/>
         </w:tabs>
         <w:spacing w:after="140" w:line="320" w:lineRule="auto"/>
         <w:ind w:left="0"/>
@@ -1022,13 +1022,13 @@
           <w:sz w:val="28"/>
           <w:szCs w:val="28"/>
         </w:rPr>
-        <w:t xml:space="preserve">	4</w:t>
+        <w:t xml:space="preserve">	3</w:t>
       </w:r>
     </w:p>
     <w:p>
       <w:pPr>
         <w:tabs>
-          <w:tab w:val="right" w:pos="8646" w:leader="dot"/>
+          <w:tab w:val="right" w:pos="8871" w:leader="dot"/>
         </w:tabs>
         <w:spacing w:after="140" w:line="320" w:lineRule="auto"/>
         <w:ind w:left="0"/>
@@ -1057,13 +1057,13 @@
           <w:sz w:val="28"/>
           <w:szCs w:val="28"/>
         </w:rPr>
-        <w:t xml:space="preserve">	5</w:t>
+        <w:t xml:space="preserve">	4</w:t>
       </w:r>
     </w:p>
     <w:p>
       <w:pPr>
         <w:tabs>
-          <w:tab w:val="right" w:pos="8646" w:leader="dot"/>
+          <w:tab w:val="right" w:pos="8871" w:leader="dot"/>
         </w:tabs>
         <w:spacing w:after="70" w:line="320" w:lineRule="auto"/>
         <w:ind w:left="480"/>
@@ -1092,13 +1092,13 @@
           <w:sz w:val="26"/>
           <w:szCs w:val="26"/>
         </w:rPr>
-        <w:t xml:space="preserve">	5</w:t>
+        <w:t xml:space="preserve">	4</w:t>
       </w:r>
     </w:p>
     <w:p>
       <w:pPr>
         <w:tabs>
-          <w:tab w:val="right" w:pos="8646" w:leader="dot"/>
+          <w:tab w:val="right" w:pos="8871" w:leader="dot"/>
         </w:tabs>
         <w:spacing w:after="70" w:line="320" w:lineRule="auto"/>
         <w:ind w:left="480"/>
@@ -1127,13 +1127,13 @@
           <w:sz w:val="26"/>
           <w:szCs w:val="26"/>
         </w:rPr>
-        <w:t xml:space="preserve">	5</w:t>
+        <w:t xml:space="preserve">	4</w:t>
       </w:r>
     </w:p>
     <w:p>
       <w:pPr>
         <w:tabs>
-          <w:tab w:val="right" w:pos="8646" w:leader="dot"/>
+          <w:tab w:val="right" w:pos="8871" w:leader="dot"/>
         </w:tabs>
         <w:spacing w:after="140" w:line="320" w:lineRule="auto"/>
         <w:ind w:left="0"/>
@@ -1162,13 +1162,13 @@
           <w:sz w:val="28"/>
           <w:szCs w:val="28"/>
         </w:rPr>
-        <w:t xml:space="preserve">	7</w:t>
+        <w:t xml:space="preserve">	6</w:t>
       </w:r>
     </w:p>
     <w:p>
       <w:pPr>
         <w:tabs>
-          <w:tab w:val="right" w:pos="8646" w:leader="dot"/>
+          <w:tab w:val="right" w:pos="8871" w:leader="dot"/>
         </w:tabs>
         <w:spacing w:after="70" w:line="320" w:lineRule="auto"/>
         <w:ind w:left="480"/>
@@ -1197,13 +1197,13 @@
           <w:sz w:val="26"/>
           <w:szCs w:val="26"/>
         </w:rPr>
-        <w:t xml:space="preserve">	7</w:t>
+        <w:t xml:space="preserve">	6</w:t>
       </w:r>
     </w:p>
     <w:p>
       <w:pPr>
         <w:tabs>
-          <w:tab w:val="right" w:pos="8646" w:leader="dot"/>
+          <w:tab w:val="right" w:pos="8871" w:leader="dot"/>
         </w:tabs>
         <w:spacing w:after="70" w:line="320" w:lineRule="auto"/>
         <w:ind w:left="480"/>
@@ -1232,13 +1232,13 @@
           <w:sz w:val="26"/>
           <w:szCs w:val="26"/>
         </w:rPr>
-        <w:t xml:space="preserve">	7</w:t>
+        <w:t xml:space="preserve">	6</w:t>
       </w:r>
     </w:p>
     <w:p>
       <w:pPr>
         <w:tabs>
-          <w:tab w:val="right" w:pos="8646" w:leader="dot"/>
+          <w:tab w:val="right" w:pos="8871" w:leader="dot"/>
         </w:tabs>
         <w:spacing w:after="140" w:line="320" w:lineRule="auto"/>
         <w:ind w:left="0"/>
@@ -1267,13 +1267,13 @@
           <w:sz w:val="28"/>
           <w:szCs w:val="28"/>
         </w:rPr>
-        <w:t xml:space="preserve">	9</w:t>
+        <w:t xml:space="preserve">	8</w:t>
       </w:r>
     </w:p>
     <w:p>
       <w:pPr>
         <w:tabs>
-          <w:tab w:val="right" w:pos="8646" w:leader="dot"/>
+          <w:tab w:val="right" w:pos="8871" w:leader="dot"/>
         </w:tabs>
         <w:spacing w:after="70" w:line="320" w:lineRule="auto"/>
         <w:ind w:left="480"/>
@@ -1302,13 +1302,13 @@
           <w:sz w:val="26"/>
           <w:szCs w:val="26"/>
         </w:rPr>
-        <w:t xml:space="preserve">	9</w:t>
+        <w:t xml:space="preserve">	8</w:t>
       </w:r>
     </w:p>
     <w:p>
       <w:pPr>
         <w:tabs>
-          <w:tab w:val="right" w:pos="8646" w:leader="dot"/>
+          <w:tab w:val="right" w:pos="8871" w:leader="dot"/>
         </w:tabs>
         <w:spacing w:after="70" w:line="320" w:lineRule="auto"/>
         <w:ind w:left="480"/>
@@ -1337,13 +1337,13 @@
           <w:sz w:val="26"/>
           <w:szCs w:val="26"/>
         </w:rPr>
-        <w:t xml:space="preserve">	9</w:t>
+        <w:t xml:space="preserve">	8</w:t>
       </w:r>
     </w:p>
     <w:p>
       <w:pPr>
         <w:tabs>
-          <w:tab w:val="right" w:pos="8646" w:leader="dot"/>
+          <w:tab w:val="right" w:pos="8871" w:leader="dot"/>
         </w:tabs>
         <w:spacing w:after="70" w:line="320" w:lineRule="auto"/>
         <w:ind w:left="480"/>
@@ -1372,13 +1372,13 @@
           <w:sz w:val="26"/>
           <w:szCs w:val="26"/>
         </w:rPr>
-        <w:t xml:space="preserve">	10</w:t>
+        <w:t xml:space="preserve">	9</w:t>
       </w:r>
     </w:p>
     <w:p>
       <w:pPr>
         <w:tabs>
-          <w:tab w:val="right" w:pos="8646" w:leader="dot"/>
+          <w:tab w:val="right" w:pos="8871" w:leader="dot"/>
         </w:tabs>
         <w:spacing w:after="70" w:line="320" w:lineRule="auto"/>
         <w:ind w:left="480"/>
@@ -1407,13 +1407,13 @@
           <w:sz w:val="26"/>
           <w:szCs w:val="26"/>
         </w:rPr>
-        <w:t xml:space="preserve">	11</w:t>
+        <w:t xml:space="preserve">	10</w:t>
       </w:r>
     </w:p>
     <w:p>
       <w:pPr>
         <w:tabs>
-          <w:tab w:val="right" w:pos="8646" w:leader="dot"/>
+          <w:tab w:val="right" w:pos="8871" w:leader="dot"/>
         </w:tabs>
         <w:spacing w:after="70" w:line="320" w:lineRule="auto"/>
         <w:ind w:left="480"/>
@@ -1442,13 +1442,13 @@
           <w:sz w:val="26"/>
           <w:szCs w:val="26"/>
         </w:rPr>
-        <w:t xml:space="preserve">	12</w:t>
+        <w:t xml:space="preserve">	10</w:t>
       </w:r>
     </w:p>
     <w:p>
       <w:pPr>
         <w:tabs>
-          <w:tab w:val="right" w:pos="8646" w:leader="dot"/>
+          <w:tab w:val="right" w:pos="8871" w:leader="dot"/>
         </w:tabs>
         <w:spacing w:after="140" w:line="320" w:lineRule="auto"/>
         <w:ind w:left="0"/>
@@ -1477,13 +1477,13 @@
           <w:sz w:val="28"/>
           <w:szCs w:val="28"/>
         </w:rPr>
-        <w:t xml:space="preserve">	13</w:t>
+        <w:t xml:space="preserve">	12</w:t>
       </w:r>
     </w:p>
     <w:p>
       <w:pPr>
         <w:tabs>
-          <w:tab w:val="right" w:pos="8646" w:leader="dot"/>
+          <w:tab w:val="right" w:pos="8871" w:leader="dot"/>
         </w:tabs>
         <w:spacing w:after="70" w:line="320" w:lineRule="auto"/>
         <w:ind w:left="480"/>
@@ -1512,13 +1512,13 @@
           <w:sz w:val="26"/>
           <w:szCs w:val="26"/>
         </w:rPr>
-        <w:t xml:space="preserve">	13</w:t>
+        <w:t xml:space="preserve">	12</w:t>
       </w:r>
     </w:p>
     <w:p>
       <w:pPr>
         <w:tabs>
-          <w:tab w:val="right" w:pos="8646" w:leader="dot"/>
+          <w:tab w:val="right" w:pos="8871" w:leader="dot"/>
         </w:tabs>
         <w:spacing w:after="70" w:line="320" w:lineRule="auto"/>
         <w:ind w:left="960"/>
@@ -1547,13 +1547,13 @@
           <w:sz w:val="24"/>
           <w:szCs w:val="24"/>
         </w:rPr>
-        <w:t xml:space="preserve">	14</w:t>
+        <w:t xml:space="preserve">	13</w:t>
       </w:r>
     </w:p>
     <w:p>
       <w:pPr>
         <w:tabs>
-          <w:tab w:val="right" w:pos="8646" w:leader="dot"/>
+          <w:tab w:val="right" w:pos="8871" w:leader="dot"/>
         </w:tabs>
         <w:spacing w:after="70" w:line="320" w:lineRule="auto"/>
         <w:ind w:left="480"/>
@@ -1582,13 +1582,13 @@
           <w:sz w:val="26"/>
           <w:szCs w:val="26"/>
         </w:rPr>
-        <w:t xml:space="preserve">	15</w:t>
+        <w:t xml:space="preserve">	14</w:t>
       </w:r>
     </w:p>
     <w:p>
       <w:pPr>
         <w:tabs>
-          <w:tab w:val="right" w:pos="8646" w:leader="dot"/>
+          <w:tab w:val="right" w:pos="8871" w:leader="dot"/>
         </w:tabs>
         <w:spacing w:after="70" w:line="320" w:lineRule="auto"/>
         <w:ind w:left="960"/>
@@ -1617,13 +1617,13 @@
           <w:sz w:val="24"/>
           <w:szCs w:val="24"/>
         </w:rPr>
-        <w:t xml:space="preserve">	16</w:t>
+        <w:t xml:space="preserve">	15</w:t>
       </w:r>
     </w:p>
     <w:p>
       <w:pPr>
         <w:tabs>
-          <w:tab w:val="right" w:pos="8646" w:leader="dot"/>
+          <w:tab w:val="right" w:pos="8871" w:leader="dot"/>
         </w:tabs>
         <w:spacing w:after="70" w:line="320" w:lineRule="auto"/>
         <w:ind w:left="480"/>
@@ -1652,13 +1652,13 @@
           <w:sz w:val="26"/>
           <w:szCs w:val="26"/>
         </w:rPr>
-        <w:t xml:space="preserve">	18</w:t>
+        <w:t xml:space="preserve">	16</w:t>
       </w:r>
     </w:p>
     <w:p>
       <w:pPr>
         <w:tabs>
-          <w:tab w:val="right" w:pos="8646" w:leader="dot"/>
+          <w:tab w:val="right" w:pos="8871" w:leader="dot"/>
         </w:tabs>
         <w:spacing w:after="70" w:line="320" w:lineRule="auto"/>
         <w:ind w:left="960"/>
@@ -1687,13 +1687,13 @@
           <w:sz w:val="24"/>
           <w:szCs w:val="24"/>
         </w:rPr>
-        <w:t xml:space="preserve">	19</w:t>
+        <w:t xml:space="preserve">	17</w:t>
       </w:r>
     </w:p>
     <w:p>
       <w:pPr>
         <w:tabs>
-          <w:tab w:val="right" w:pos="8646" w:leader="dot"/>
+          <w:tab w:val="right" w:pos="8871" w:leader="dot"/>
         </w:tabs>
         <w:spacing w:after="140" w:line="320" w:lineRule="auto"/>
         <w:ind w:left="0"/>
@@ -1722,13 +1722,13 @@
           <w:sz w:val="28"/>
           <w:szCs w:val="28"/>
         </w:rPr>
-        <w:t xml:space="preserve">	20</w:t>
+        <w:t xml:space="preserve">	18</w:t>
       </w:r>
     </w:p>
     <w:p>
       <w:pPr>
         <w:tabs>
-          <w:tab w:val="right" w:pos="8646" w:leader="dot"/>
+          <w:tab w:val="right" w:pos="8871" w:leader="dot"/>
         </w:tabs>
         <w:spacing w:after="140" w:line="320" w:lineRule="auto"/>
         <w:ind w:left="0"/>
@@ -1757,7 +1757,7 @@
           <w:sz w:val="28"/>
           <w:szCs w:val="28"/>
         </w:rPr>
-        <w:t xml:space="preserve">	22</w:t>
+        <w:t xml:space="preserve">	19</w:t>
       </w:r>
     </w:p>
     <w:p>
@@ -1938,7 +1938,7 @@
     </w:p>
     <w:tbl>
       <w:tblPr>
-        <w:tblW w:type="dxa" w:w="8846"/>
+        <w:tblW w:type="dxa" w:w="9071"/>
         <w:tblBorders>
           <w:top w:val="single" w:color="auto" w:sz="4"/>
           <w:left w:val="single" w:color="auto" w:sz="4"/>
@@ -1951,7 +1951,7 @@
       <w:tblGrid>
         <w:gridCol w:w="1100"/>
         <w:gridCol w:w="1800"/>
-        <w:gridCol w:w="5946"/>
+        <w:gridCol w:w="6171"/>
       </w:tblGrid>
       <w:tr>
         <w:trPr>
@@ -2030,7 +2030,7 @@
         </w:tc>
         <w:tc>
           <w:tcPr>
-            <w:tcW w:type="dxa" w:w="5946"/>
+            <w:tcW w:type="dxa" w:w="6171"/>
             <w:tcBorders>
               <w:top w:val="single" w:color="BFBFBF" w:sz="4"/>
               <w:left w:val="single" w:color="BFBFBF" w:sz="4"/>
@@ -2140,7 +2140,7 @@
         </w:tc>
         <w:tc>
           <w:tcPr>
-            <w:tcW w:type="dxa" w:w="5946"/>
+            <w:tcW w:type="dxa" w:w="6171"/>
             <w:tcBorders>
               <w:top w:val="single" w:color="BFBFBF" w:sz="4"/>
               <w:left w:val="single" w:color="BFBFBF" w:sz="4"/>
@@ -2250,7 +2250,7 @@
         </w:tc>
         <w:tc>
           <w:tcPr>
-            <w:tcW w:type="dxa" w:w="5946"/>
+            <w:tcW w:type="dxa" w:w="6171"/>
             <w:tcBorders>
               <w:top w:val="single" w:color="BFBFBF" w:sz="4"/>
               <w:left w:val="single" w:color="BFBFBF" w:sz="4"/>
@@ -2360,7 +2360,7 @@
         </w:tc>
         <w:tc>
           <w:tcPr>
-            <w:tcW w:type="dxa" w:w="5946"/>
+            <w:tcW w:type="dxa" w:w="6171"/>
             <w:tcBorders>
               <w:top w:val="single" w:color="BFBFBF" w:sz="4"/>
               <w:left w:val="single" w:color="BFBFBF" w:sz="4"/>
@@ -2470,7 +2470,7 @@
         </w:tc>
         <w:tc>
           <w:tcPr>
-            <w:tcW w:type="dxa" w:w="5946"/>
+            <w:tcW w:type="dxa" w:w="6171"/>
             <w:tcBorders>
               <w:top w:val="single" w:color="BFBFBF" w:sz="4"/>
               <w:left w:val="single" w:color="BFBFBF" w:sz="4"/>
@@ -2571,7 +2571,7 @@
     </w:p>
     <w:tbl>
       <w:tblPr>
-        <w:tblW w:type="dxa" w:w="8846"/>
+        <w:tblW w:type="dxa" w:w="9071"/>
         <w:tblBorders>
           <w:top w:val="single" w:color="auto" w:sz="4"/>
           <w:left w:val="single" w:color="auto" w:sz="4"/>
@@ -2583,7 +2583,7 @@
       </w:tblPr>
       <w:tblGrid>
         <w:gridCol w:w="3000"/>
-        <w:gridCol w:w="5846"/>
+        <w:gridCol w:w="6071"/>
       </w:tblGrid>
       <w:tr>
         <w:trPr>
@@ -2626,7 +2626,7 @@
         </w:tc>
         <w:tc>
           <w:tcPr>
-            <w:tcW w:type="dxa" w:w="5846"/>
+            <w:tcW w:type="dxa" w:w="6071"/>
             <w:tcBorders>
               <w:top w:val="single" w:color="BFBFBF" w:sz="4"/>
               <w:left w:val="single" w:color="BFBFBF" w:sz="4"/>
@@ -2701,7 +2701,7 @@
         </w:tc>
         <w:tc>
           <w:tcPr>
-            <w:tcW w:type="dxa" w:w="5846"/>
+            <w:tcW w:type="dxa" w:w="6071"/>
             <w:tcBorders>
               <w:top w:val="single" w:color="BFBFBF" w:sz="4"/>
               <w:left w:val="single" w:color="BFBFBF" w:sz="4"/>
@@ -2776,7 +2776,7 @@
         </w:tc>
         <w:tc>
           <w:tcPr>
-            <w:tcW w:type="dxa" w:w="5846"/>
+            <w:tcW w:type="dxa" w:w="6071"/>
             <w:tcBorders>
               <w:top w:val="single" w:color="BFBFBF" w:sz="4"/>
               <w:left w:val="single" w:color="BFBFBF" w:sz="4"/>
@@ -2851,7 +2851,7 @@
         </w:tc>
         <w:tc>
           <w:tcPr>
-            <w:tcW w:type="dxa" w:w="5846"/>
+            <w:tcW w:type="dxa" w:w="6071"/>
             <w:tcBorders>
               <w:top w:val="single" w:color="BFBFBF" w:sz="4"/>
               <w:left w:val="single" w:color="BFBFBF" w:sz="4"/>
@@ -2926,7 +2926,7 @@
         </w:tc>
         <w:tc>
           <w:tcPr>
-            <w:tcW w:type="dxa" w:w="5846"/>
+            <w:tcW w:type="dxa" w:w="6071"/>
             <w:tcBorders>
               <w:top w:val="single" w:color="BFBFBF" w:sz="4"/>
               <w:left w:val="single" w:color="BFBFBF" w:sz="4"/>
@@ -3001,7 +3001,7 @@
         </w:tc>
         <w:tc>
           <w:tcPr>
-            <w:tcW w:type="dxa" w:w="5846"/>
+            <w:tcW w:type="dxa" w:w="6071"/>
             <w:tcBorders>
               <w:top w:val="single" w:color="BFBFBF" w:sz="4"/>
               <w:left w:val="single" w:color="BFBFBF" w:sz="4"/>
@@ -3076,7 +3076,7 @@
         </w:tc>
         <w:tc>
           <w:tcPr>
-            <w:tcW w:type="dxa" w:w="5846"/>
+            <w:tcW w:type="dxa" w:w="6071"/>
             <w:tcBorders>
               <w:top w:val="single" w:color="BFBFBF" w:sz="4"/>
               <w:left w:val="single" w:color="BFBFBF" w:sz="4"/>
@@ -3148,7 +3148,7 @@
     </w:p>
     <w:tbl>
       <w:tblPr>
-        <w:tblW w:type="dxa" w:w="8846"/>
+        <w:tblW w:type="dxa" w:w="9071"/>
         <w:tblBorders>
           <w:top w:val="single" w:color="auto" w:sz="4"/>
           <w:left w:val="single" w:color="auto" w:sz="4"/>
@@ -3161,7 +3161,7 @@
       <w:tblGrid>
         <w:gridCol w:w="3000"/>
         <w:gridCol w:w="900"/>
-        <w:gridCol w:w="4946"/>
+        <w:gridCol w:w="5171"/>
       </w:tblGrid>
       <w:tr>
         <w:trPr>
@@ -3240,7 +3240,7 @@
         </w:tc>
         <w:tc>
           <w:tcPr>
-            <w:tcW w:type="dxa" w:w="4946"/>
+            <w:tcW w:type="dxa" w:w="5171"/>
             <w:tcBorders>
               <w:top w:val="single" w:color="BFBFBF" w:sz="4"/>
               <w:left w:val="single" w:color="BFBFBF" w:sz="4"/>
@@ -3350,7 +3350,7 @@
         </w:tc>
         <w:tc>
           <w:tcPr>
-            <w:tcW w:type="dxa" w:w="4946"/>
+            <w:tcW w:type="dxa" w:w="5171"/>
             <w:tcBorders>
               <w:top w:val="single" w:color="BFBFBF" w:sz="4"/>
               <w:left w:val="single" w:color="BFBFBF" w:sz="4"/>
@@ -3460,7 +3460,7 @@
         </w:tc>
         <w:tc>
           <w:tcPr>
-            <w:tcW w:type="dxa" w:w="4946"/>
+            <w:tcW w:type="dxa" w:w="5171"/>
             <w:tcBorders>
               <w:top w:val="single" w:color="BFBFBF" w:sz="4"/>
               <w:left w:val="single" w:color="BFBFBF" w:sz="4"/>
@@ -3570,7 +3570,7 @@
         </w:tc>
         <w:tc>
           <w:tcPr>
-            <w:tcW w:type="dxa" w:w="4946"/>
+            <w:tcW w:type="dxa" w:w="5171"/>
             <w:tcBorders>
               <w:top w:val="single" w:color="BFBFBF" w:sz="4"/>
               <w:left w:val="single" w:color="BFBFBF" w:sz="4"/>
@@ -3680,7 +3680,7 @@
         </w:tc>
         <w:tc>
           <w:tcPr>
-            <w:tcW w:type="dxa" w:w="4946"/>
+            <w:tcW w:type="dxa" w:w="5171"/>
             <w:tcBorders>
               <w:top w:val="single" w:color="BFBFBF" w:sz="4"/>
               <w:left w:val="single" w:color="BFBFBF" w:sz="4"/>
@@ -3790,7 +3790,7 @@
         </w:tc>
         <w:tc>
           <w:tcPr>
-            <w:tcW w:type="dxa" w:w="4946"/>
+            <w:tcW w:type="dxa" w:w="5171"/>
             <w:tcBorders>
               <w:top w:val="single" w:color="BFBFBF" w:sz="4"/>
               <w:left w:val="single" w:color="BFBFBF" w:sz="4"/>
@@ -3900,7 +3900,7 @@
         </w:tc>
         <w:tc>
           <w:tcPr>
-            <w:tcW w:type="dxa" w:w="4946"/>
+            <w:tcW w:type="dxa" w:w="5171"/>
             <w:tcBorders>
               <w:top w:val="single" w:color="BFBFBF" w:sz="4"/>
               <w:left w:val="single" w:color="BFBFBF" w:sz="4"/>
@@ -4010,7 +4010,7 @@
         </w:tc>
         <w:tc>
           <w:tcPr>
-            <w:tcW w:type="dxa" w:w="4946"/>
+            <w:tcW w:type="dxa" w:w="5171"/>
             <w:tcBorders>
               <w:top w:val="single" w:color="BFBFBF" w:sz="4"/>
               <w:left w:val="single" w:color="BFBFBF" w:sz="4"/>
@@ -4120,7 +4120,7 @@
         </w:tc>
         <w:tc>
           <w:tcPr>
-            <w:tcW w:type="dxa" w:w="4946"/>
+            <w:tcW w:type="dxa" w:w="5171"/>
             <w:tcBorders>
               <w:top w:val="single" w:color="BFBFBF" w:sz="4"/>
               <w:left w:val="single" w:color="BFBFBF" w:sz="4"/>
@@ -4230,7 +4230,7 @@
         </w:tc>
         <w:tc>
           <w:tcPr>
-            <w:tcW w:type="dxa" w:w="4946"/>
+            <w:tcW w:type="dxa" w:w="5171"/>
             <w:tcBorders>
               <w:top w:val="single" w:color="BFBFBF" w:sz="4"/>
               <w:left w:val="single" w:color="BFBFBF" w:sz="4"/>
@@ -4340,7 +4340,7 @@
         </w:tc>
         <w:tc>
           <w:tcPr>
-            <w:tcW w:type="dxa" w:w="4946"/>
+            <w:tcW w:type="dxa" w:w="5171"/>
             <w:tcBorders>
               <w:top w:val="single" w:color="BFBFBF" w:sz="4"/>
               <w:left w:val="single" w:color="BFBFBF" w:sz="4"/>
@@ -4450,7 +4450,7 @@
         </w:tc>
         <w:tc>
           <w:tcPr>
-            <w:tcW w:type="dxa" w:w="4946"/>
+            <w:tcW w:type="dxa" w:w="5171"/>
             <w:tcBorders>
               <w:top w:val="single" w:color="BFBFBF" w:sz="4"/>
               <w:left w:val="single" w:color="BFBFBF" w:sz="4"/>
@@ -4560,7 +4560,7 @@
         </w:tc>
         <w:tc>
           <w:tcPr>
-            <w:tcW w:type="dxa" w:w="4946"/>
+            <w:tcW w:type="dxa" w:w="5171"/>
             <w:tcBorders>
               <w:top w:val="single" w:color="BFBFBF" w:sz="4"/>
               <w:left w:val="single" w:color="BFBFBF" w:sz="4"/>
@@ -4670,7 +4670,7 @@
         </w:tc>
         <w:tc>
           <w:tcPr>
-            <w:tcW w:type="dxa" w:w="4946"/>
+            <w:tcW w:type="dxa" w:w="5171"/>
             <w:tcBorders>
               <w:top w:val="single" w:color="BFBFBF" w:sz="4"/>
               <w:left w:val="single" w:color="BFBFBF" w:sz="4"/>
@@ -4780,7 +4780,7 @@
         </w:tc>
         <w:tc>
           <w:tcPr>
-            <w:tcW w:type="dxa" w:w="4946"/>
+            <w:tcW w:type="dxa" w:w="5171"/>
             <w:tcBorders>
               <w:top w:val="single" w:color="BFBFBF" w:sz="4"/>
               <w:left w:val="single" w:color="BFBFBF" w:sz="4"/>
@@ -4890,7 +4890,7 @@
         </w:tc>
         <w:tc>
           <w:tcPr>
-            <w:tcW w:type="dxa" w:w="4946"/>
+            <w:tcW w:type="dxa" w:w="5171"/>
             <w:tcBorders>
               <w:top w:val="single" w:color="BFBFBF" w:sz="4"/>
               <w:left w:val="single" w:color="BFBFBF" w:sz="4"/>
@@ -5000,7 +5000,7 @@
         </w:tc>
         <w:tc>
           <w:tcPr>
-            <w:tcW w:type="dxa" w:w="4946"/>
+            <w:tcW w:type="dxa" w:w="5171"/>
             <w:tcBorders>
               <w:top w:val="single" w:color="BFBFBF" w:sz="4"/>
               <w:left w:val="single" w:color="BFBFBF" w:sz="4"/>
@@ -5110,7 +5110,7 @@
         </w:tc>
         <w:tc>
           <w:tcPr>
-            <w:tcW w:type="dxa" w:w="4946"/>
+            <w:tcW w:type="dxa" w:w="5171"/>
             <w:tcBorders>
               <w:top w:val="single" w:color="BFBFBF" w:sz="4"/>
               <w:left w:val="single" w:color="BFBFBF" w:sz="4"/>
@@ -5220,7 +5220,7 @@
         </w:tc>
         <w:tc>
           <w:tcPr>
-            <w:tcW w:type="dxa" w:w="4946"/>
+            <w:tcW w:type="dxa" w:w="5171"/>
             <w:tcBorders>
               <w:top w:val="single" w:color="BFBFBF" w:sz="4"/>
               <w:left w:val="single" w:color="BFBFBF" w:sz="4"/>
@@ -5303,7 +5303,7 @@
     </w:p>
     <w:tbl>
       <w:tblPr>
-        <w:tblW w:type="dxa" w:w="8846"/>
+        <w:tblW w:type="dxa" w:w="9071"/>
         <w:tblBorders>
           <w:top w:val="single" w:color="auto" w:sz="4"/>
           <w:left w:val="single" w:color="auto" w:sz="4"/>
@@ -5315,7 +5315,7 @@
       </w:tblPr>
       <w:tblGrid>
         <w:gridCol w:w="3800"/>
-        <w:gridCol w:w="5046"/>
+        <w:gridCol w:w="5271"/>
       </w:tblGrid>
       <w:tr>
         <w:trPr>
@@ -5358,7 +5358,7 @@
         </w:tc>
         <w:tc>
           <w:tcPr>
-            <w:tcW w:type="dxa" w:w="5046"/>
+            <w:tcW w:type="dxa" w:w="5271"/>
             <w:tcBorders>
               <w:top w:val="single" w:color="BFBFBF" w:sz="4"/>
               <w:left w:val="single" w:color="BFBFBF" w:sz="4"/>
@@ -5433,7 +5433,7 @@
         </w:tc>
         <w:tc>
           <w:tcPr>
-            <w:tcW w:type="dxa" w:w="5046"/>
+            <w:tcW w:type="dxa" w:w="5271"/>
             <w:tcBorders>
               <w:top w:val="single" w:color="BFBFBF" w:sz="4"/>
               <w:left w:val="single" w:color="BFBFBF" w:sz="4"/>
@@ -5508,7 +5508,7 @@
         </w:tc>
         <w:tc>
           <w:tcPr>
-            <w:tcW w:type="dxa" w:w="5046"/>
+            <w:tcW w:type="dxa" w:w="5271"/>
             <w:tcBorders>
               <w:top w:val="single" w:color="BFBFBF" w:sz="4"/>
               <w:left w:val="single" w:color="BFBFBF" w:sz="4"/>
@@ -5631,7 +5631,7 @@
     </w:p>
     <w:tbl>
       <w:tblPr>
-        <w:tblW w:type="dxa" w:w="8846"/>
+        <w:tblW w:type="dxa" w:w="9071"/>
         <w:tblBorders>
           <w:top w:val="single" w:color="auto" w:sz="4"/>
           <w:left w:val="single" w:color="auto" w:sz="4"/>
@@ -5644,7 +5644,7 @@
       <w:tblGrid>
         <w:gridCol w:w="2400"/>
         <w:gridCol w:w="2200"/>
-        <w:gridCol w:w="4246"/>
+        <w:gridCol w:w="4471"/>
       </w:tblGrid>
       <w:tr>
         <w:trPr>
@@ -5723,7 +5723,7 @@
         </w:tc>
         <w:tc>
           <w:tcPr>
-            <w:tcW w:type="dxa" w:w="4246"/>
+            <w:tcW w:type="dxa" w:w="4471"/>
             <w:tcBorders>
               <w:top w:val="single" w:color="BFBFBF" w:sz="4"/>
               <w:left w:val="single" w:color="BFBFBF" w:sz="4"/>
@@ -5833,7 +5833,7 @@
         </w:tc>
         <w:tc>
           <w:tcPr>
-            <w:tcW w:type="dxa" w:w="4246"/>
+            <w:tcW w:type="dxa" w:w="4471"/>
             <w:tcBorders>
               <w:top w:val="single" w:color="BFBFBF" w:sz="4"/>
               <w:left w:val="single" w:color="BFBFBF" w:sz="4"/>
@@ -5943,7 +5943,7 @@
         </w:tc>
         <w:tc>
           <w:tcPr>
-            <w:tcW w:type="dxa" w:w="4246"/>
+            <w:tcW w:type="dxa" w:w="4471"/>
             <w:tcBorders>
               <w:top w:val="single" w:color="BFBFBF" w:sz="4"/>
               <w:left w:val="single" w:color="BFBFBF" w:sz="4"/>
@@ -6053,7 +6053,7 @@
         </w:tc>
         <w:tc>
           <w:tcPr>
-            <w:tcW w:type="dxa" w:w="4246"/>
+            <w:tcW w:type="dxa" w:w="4471"/>
             <w:tcBorders>
               <w:top w:val="single" w:color="BFBFBF" w:sz="4"/>
               <w:left w:val="single" w:color="BFBFBF" w:sz="4"/>
@@ -6123,7 +6123,7 @@
     </w:p>
     <w:tbl>
       <w:tblPr>
-        <w:tblW w:type="dxa" w:w="8846"/>
+        <w:tblW w:type="dxa" w:w="9071"/>
         <w:tblBorders>
           <w:top w:val="single" w:color="auto" w:sz="4"/>
           <w:left w:val="single" w:color="auto" w:sz="4"/>
@@ -6136,7 +6136,7 @@
       <w:tblGrid>
         <w:gridCol w:w="2400"/>
         <w:gridCol w:w="1800"/>
-        <w:gridCol w:w="4646"/>
+        <w:gridCol w:w="4871"/>
       </w:tblGrid>
       <w:tr>
         <w:trPr>
@@ -6215,7 +6215,7 @@
         </w:tc>
         <w:tc>
           <w:tcPr>
-            <w:tcW w:type="dxa" w:w="4646"/>
+            <w:tcW w:type="dxa" w:w="4871"/>
             <w:tcBorders>
               <w:top w:val="single" w:color="BFBFBF" w:sz="4"/>
               <w:left w:val="single" w:color="BFBFBF" w:sz="4"/>
@@ -6325,7 +6325,7 @@
         </w:tc>
         <w:tc>
           <w:tcPr>
-            <w:tcW w:type="dxa" w:w="4646"/>
+            <w:tcW w:type="dxa" w:w="4871"/>
             <w:tcBorders>
               <w:top w:val="single" w:color="BFBFBF" w:sz="4"/>
               <w:left w:val="single" w:color="BFBFBF" w:sz="4"/>
@@ -6435,7 +6435,7 @@
         </w:tc>
         <w:tc>
           <w:tcPr>
-            <w:tcW w:type="dxa" w:w="4646"/>
+            <w:tcW w:type="dxa" w:w="4871"/>
             <w:tcBorders>
               <w:top w:val="single" w:color="BFBFBF" w:sz="4"/>
               <w:left w:val="single" w:color="BFBFBF" w:sz="4"/>
@@ -6545,7 +6545,7 @@
         </w:tc>
         <w:tc>
           <w:tcPr>
-            <w:tcW w:type="dxa" w:w="4646"/>
+            <w:tcW w:type="dxa" w:w="4871"/>
             <w:tcBorders>
               <w:top w:val="single" w:color="BFBFBF" w:sz="4"/>
               <w:left w:val="single" w:color="BFBFBF" w:sz="4"/>
@@ -6615,7 +6615,7 @@
     </w:p>
     <w:tbl>
       <w:tblPr>
-        <w:tblW w:type="dxa" w:w="8846"/>
+        <w:tblW w:type="dxa" w:w="9071"/>
         <w:tblBorders>
           <w:top w:val="single" w:color="auto" w:sz="4"/>
           <w:left w:val="single" w:color="auto" w:sz="4"/>
@@ -6627,7 +6627,7 @@
       </w:tblPr>
       <w:tblGrid>
         <w:gridCol w:w="3400"/>
-        <w:gridCol w:w="5446"/>
+        <w:gridCol w:w="5671"/>
       </w:tblGrid>
       <w:tr>
         <w:trPr>
@@ -6670,7 +6670,7 @@
         </w:tc>
         <w:tc>
           <w:tcPr>
-            <w:tcW w:type="dxa" w:w="5446"/>
+            <w:tcW w:type="dxa" w:w="5671"/>
             <w:tcBorders>
               <w:top w:val="single" w:color="BFBFBF" w:sz="4"/>
               <w:left w:val="single" w:color="BFBFBF" w:sz="4"/>
@@ -6745,7 +6745,7 @@
         </w:tc>
         <w:tc>
           <w:tcPr>
-            <w:tcW w:type="dxa" w:w="5446"/>
+            <w:tcW w:type="dxa" w:w="5671"/>
             <w:tcBorders>
               <w:top w:val="single" w:color="BFBFBF" w:sz="4"/>
               <w:left w:val="single" w:color="BFBFBF" w:sz="4"/>
@@ -6820,7 +6820,7 @@
         </w:tc>
         <w:tc>
           <w:tcPr>
-            <w:tcW w:type="dxa" w:w="5446"/>
+            <w:tcW w:type="dxa" w:w="5671"/>
             <w:tcBorders>
               <w:top w:val="single" w:color="BFBFBF" w:sz="4"/>
               <w:left w:val="single" w:color="BFBFBF" w:sz="4"/>
@@ -6895,7 +6895,7 @@
         </w:tc>
         <w:tc>
           <w:tcPr>
-            <w:tcW w:type="dxa" w:w="5446"/>
+            <w:tcW w:type="dxa" w:w="5671"/>
             <w:tcBorders>
               <w:top w:val="single" w:color="BFBFBF" w:sz="4"/>
               <w:left w:val="single" w:color="BFBFBF" w:sz="4"/>
@@ -7029,7 +7029,7 @@
     </w:p>
     <w:tbl>
       <w:tblPr>
-        <w:tblW w:type="dxa" w:w="8846"/>
+        <w:tblW w:type="dxa" w:w="9071"/>
         <w:tblBorders>
           <w:top w:val="single" w:color="auto" w:sz="4"/>
           <w:left w:val="single" w:color="auto" w:sz="4"/>
@@ -7042,7 +7042,7 @@
       <w:tblGrid>
         <w:gridCol w:w="2000"/>
         <w:gridCol w:w="1400"/>
-        <w:gridCol w:w="5446"/>
+        <w:gridCol w:w="5671"/>
       </w:tblGrid>
       <w:tr>
         <w:trPr>
@@ -7121,7 +7121,7 @@
         </w:tc>
         <w:tc>
           <w:tcPr>
-            <w:tcW w:type="dxa" w:w="5446"/>
+            <w:tcW w:type="dxa" w:w="5671"/>
             <w:tcBorders>
               <w:top w:val="single" w:color="BFBFBF" w:sz="4"/>
               <w:left w:val="single" w:color="BFBFBF" w:sz="4"/>
@@ -7231,7 +7231,7 @@
         </w:tc>
         <w:tc>
           <w:tcPr>
-            <w:tcW w:type="dxa" w:w="5446"/>
+            <w:tcW w:type="dxa" w:w="5671"/>
             <w:tcBorders>
               <w:top w:val="single" w:color="BFBFBF" w:sz="4"/>
               <w:left w:val="single" w:color="BFBFBF" w:sz="4"/>
@@ -7341,7 +7341,7 @@
         </w:tc>
         <w:tc>
           <w:tcPr>
-            <w:tcW w:type="dxa" w:w="5446"/>
+            <w:tcW w:type="dxa" w:w="5671"/>
             <w:tcBorders>
               <w:top w:val="single" w:color="BFBFBF" w:sz="4"/>
               <w:left w:val="single" w:color="BFBFBF" w:sz="4"/>
@@ -7451,7 +7451,7 @@
         </w:tc>
         <w:tc>
           <w:tcPr>
-            <w:tcW w:type="dxa" w:w="5446"/>
+            <w:tcW w:type="dxa" w:w="5671"/>
             <w:tcBorders>
               <w:top w:val="single" w:color="BFBFBF" w:sz="4"/>
               <w:left w:val="single" w:color="BFBFBF" w:sz="4"/>
@@ -7561,7 +7561,7 @@
         </w:tc>
         <w:tc>
           <w:tcPr>
-            <w:tcW w:type="dxa" w:w="5446"/>
+            <w:tcW w:type="dxa" w:w="5671"/>
             <w:tcBorders>
               <w:top w:val="single" w:color="BFBFBF" w:sz="4"/>
               <w:left w:val="single" w:color="BFBFBF" w:sz="4"/>
@@ -7616,7 +7616,7 @@
     </w:p>
     <w:tbl>
       <w:tblPr>
-        <w:tblW w:type="dxa" w:w="8846"/>
+        <w:tblW w:type="dxa" w:w="9071"/>
         <w:tblBorders>
           <w:top w:val="single" w:color="auto" w:sz="4"/>
           <w:left w:val="single" w:color="auto" w:sz="4"/>
@@ -7628,7 +7628,7 @@
       </w:tblPr>
       <w:tblGrid>
         <w:gridCol w:w="3800"/>
-        <w:gridCol w:w="5046"/>
+        <w:gridCol w:w="5271"/>
       </w:tblGrid>
       <w:tr>
         <w:trPr>
@@ -7671,7 +7671,7 @@
         </w:tc>
         <w:tc>
           <w:tcPr>
-            <w:tcW w:type="dxa" w:w="5046"/>
+            <w:tcW w:type="dxa" w:w="5271"/>
             <w:tcBorders>
               <w:top w:val="single" w:color="BFBFBF" w:sz="4"/>
               <w:left w:val="single" w:color="BFBFBF" w:sz="4"/>
@@ -7746,7 +7746,7 @@
         </w:tc>
         <w:tc>
           <w:tcPr>
-            <w:tcW w:type="dxa" w:w="5046"/>
+            <w:tcW w:type="dxa" w:w="5271"/>
             <w:tcBorders>
               <w:top w:val="single" w:color="BFBFBF" w:sz="4"/>
               <w:left w:val="single" w:color="BFBFBF" w:sz="4"/>
@@ -7829,7 +7829,7 @@
     </w:p>
     <w:tbl>
       <w:tblPr>
-        <w:tblW w:type="dxa" w:w="8846"/>
+        <w:tblW w:type="dxa" w:w="9071"/>
         <w:tblBorders>
           <w:top w:val="single" w:color="auto" w:sz="4"/>
           <w:left w:val="single" w:color="auto" w:sz="4"/>
@@ -7842,7 +7842,7 @@
       <w:tblGrid>
         <w:gridCol w:w="2400"/>
         <w:gridCol w:w="2300"/>
-        <w:gridCol w:w="4146"/>
+        <w:gridCol w:w="4371"/>
       </w:tblGrid>
       <w:tr>
         <w:trPr>
@@ -7921,7 +7921,7 @@
         </w:tc>
         <w:tc>
           <w:tcPr>
-            <w:tcW w:type="dxa" w:w="4146"/>
+            <w:tcW w:type="dxa" w:w="4371"/>
             <w:tcBorders>
               <w:top w:val="single" w:color="BFBFBF" w:sz="4"/>
               <w:left w:val="single" w:color="BFBFBF" w:sz="4"/>
@@ -8031,7 +8031,7 @@
         </w:tc>
         <w:tc>
           <w:tcPr>
-            <w:tcW w:type="dxa" w:w="4146"/>
+            <w:tcW w:type="dxa" w:w="4371"/>
             <w:tcBorders>
               <w:top w:val="single" w:color="BFBFBF" w:sz="4"/>
               <w:left w:val="single" w:color="BFBFBF" w:sz="4"/>
@@ -8141,7 +8141,7 @@
         </w:tc>
         <w:tc>
           <w:tcPr>
-            <w:tcW w:type="dxa" w:w="4146"/>
+            <w:tcW w:type="dxa" w:w="4371"/>
             <w:tcBorders>
               <w:top w:val="single" w:color="BFBFBF" w:sz="4"/>
               <w:left w:val="single" w:color="BFBFBF" w:sz="4"/>
@@ -8251,7 +8251,7 @@
         </w:tc>
         <w:tc>
           <w:tcPr>
-            <w:tcW w:type="dxa" w:w="4146"/>
+            <w:tcW w:type="dxa" w:w="4371"/>
             <w:tcBorders>
               <w:top w:val="single" w:color="BFBFBF" w:sz="4"/>
               <w:left w:val="single" w:color="BFBFBF" w:sz="4"/>
@@ -8361,7 +8361,7 @@
         </w:tc>
         <w:tc>
           <w:tcPr>
-            <w:tcW w:type="dxa" w:w="4146"/>
+            <w:tcW w:type="dxa" w:w="4371"/>
             <w:tcBorders>
               <w:top w:val="single" w:color="BFBFBF" w:sz="4"/>
               <w:left w:val="single" w:color="BFBFBF" w:sz="4"/>
@@ -8471,7 +8471,7 @@
         </w:tc>
         <w:tc>
           <w:tcPr>
-            <w:tcW w:type="dxa" w:w="4146"/>
+            <w:tcW w:type="dxa" w:w="4371"/>
             <w:tcBorders>
               <w:top w:val="single" w:color="BFBFBF" w:sz="4"/>
               <w:left w:val="single" w:color="BFBFBF" w:sz="4"/>
@@ -8581,7 +8581,7 @@
         </w:tc>
         <w:tc>
           <w:tcPr>
-            <w:tcW w:type="dxa" w:w="4146"/>
+            <w:tcW w:type="dxa" w:w="4371"/>
             <w:tcBorders>
               <w:top w:val="single" w:color="BFBFBF" w:sz="4"/>
               <w:left w:val="single" w:color="BFBFBF" w:sz="4"/>
@@ -8691,7 +8691,7 @@
         </w:tc>
         <w:tc>
           <w:tcPr>
-            <w:tcW w:type="dxa" w:w="4146"/>
+            <w:tcW w:type="dxa" w:w="4371"/>
             <w:tcBorders>
               <w:top w:val="single" w:color="BFBFBF" w:sz="4"/>
               <w:left w:val="single" w:color="BFBFBF" w:sz="4"/>
@@ -8801,7 +8801,7 @@
         </w:tc>
         <w:tc>
           <w:tcPr>
-            <w:tcW w:type="dxa" w:w="4146"/>
+            <w:tcW w:type="dxa" w:w="4371"/>
             <w:tcBorders>
               <w:top w:val="single" w:color="BFBFBF" w:sz="4"/>
               <w:left w:val="single" w:color="BFBFBF" w:sz="4"/>
@@ -9034,7 +9034,7 @@
     </w:p>
     <w:tbl>
       <w:tblPr>
-        <w:tblW w:type="dxa" w:w="8846"/>
+        <w:tblW w:type="dxa" w:w="9071"/>
         <w:tblBorders>
           <w:top w:val="single" w:color="auto" w:sz="4"/>
           <w:left w:val="single" w:color="auto" w:sz="4"/>
@@ -9047,7 +9047,7 @@
       <w:tblGrid>
         <w:gridCol w:w="2600"/>
         <w:gridCol w:w="1600"/>
-        <w:gridCol w:w="4646"/>
+        <w:gridCol w:w="4871"/>
       </w:tblGrid>
       <w:tr>
         <w:trPr>
@@ -9126,7 +9126,7 @@
         </w:tc>
         <w:tc>
           <w:tcPr>
-            <w:tcW w:type="dxa" w:w="4646"/>
+            <w:tcW w:type="dxa" w:w="4871"/>
             <w:tcBorders>
               <w:top w:val="single" w:color="BFBFBF" w:sz="4"/>
               <w:left w:val="single" w:color="BFBFBF" w:sz="4"/>
@@ -9236,7 +9236,7 @@
         </w:tc>
         <w:tc>
           <w:tcPr>
-            <w:tcW w:type="dxa" w:w="4646"/>
+            <w:tcW w:type="dxa" w:w="4871"/>
             <w:tcBorders>
               <w:top w:val="single" w:color="BFBFBF" w:sz="4"/>
               <w:left w:val="single" w:color="BFBFBF" w:sz="4"/>
@@ -9346,7 +9346,7 @@
         </w:tc>
         <w:tc>
           <w:tcPr>
-            <w:tcW w:type="dxa" w:w="4646"/>
+            <w:tcW w:type="dxa" w:w="4871"/>
             <w:tcBorders>
               <w:top w:val="single" w:color="BFBFBF" w:sz="4"/>
               <w:left w:val="single" w:color="BFBFBF" w:sz="4"/>
@@ -9456,7 +9456,7 @@
         </w:tc>
         <w:tc>
           <w:tcPr>
-            <w:tcW w:type="dxa" w:w="4646"/>
+            <w:tcW w:type="dxa" w:w="4871"/>
             <w:tcBorders>
               <w:top w:val="single" w:color="BFBFBF" w:sz="4"/>
               <w:left w:val="single" w:color="BFBFBF" w:sz="4"/>
@@ -9566,7 +9566,7 @@
         </w:tc>
         <w:tc>
           <w:tcPr>
-            <w:tcW w:type="dxa" w:w="4646"/>
+            <w:tcW w:type="dxa" w:w="4871"/>
             <w:tcBorders>
               <w:top w:val="single" w:color="BFBFBF" w:sz="4"/>
               <w:left w:val="single" w:color="BFBFBF" w:sz="4"/>
@@ -9676,7 +9676,7 @@
         </w:tc>
         <w:tc>
           <w:tcPr>
-            <w:tcW w:type="dxa" w:w="4646"/>
+            <w:tcW w:type="dxa" w:w="4871"/>
             <w:tcBorders>
               <w:top w:val="single" w:color="BFBFBF" w:sz="4"/>
               <w:left w:val="single" w:color="BFBFBF" w:sz="4"/>
@@ -9786,7 +9786,7 @@
         </w:tc>
         <w:tc>
           <w:tcPr>
-            <w:tcW w:type="dxa" w:w="4646"/>
+            <w:tcW w:type="dxa" w:w="4871"/>
             <w:tcBorders>
               <w:top w:val="single" w:color="BFBFBF" w:sz="4"/>
               <w:left w:val="single" w:color="BFBFBF" w:sz="4"/>
@@ -9876,7 +9876,7 @@
     </w:p>
     <w:tbl>
       <w:tblPr>
-        <w:tblW w:type="dxa" w:w="8846"/>
+        <w:tblW w:type="dxa" w:w="9071"/>
         <w:tblBorders>
           <w:top w:val="single" w:color="auto" w:sz="4"/>
           <w:left w:val="single" w:color="auto" w:sz="4"/>
@@ -9889,7 +9889,7 @@
       <w:tblGrid>
         <w:gridCol w:w="2200"/>
         <w:gridCol w:w="700"/>
-        <w:gridCol w:w="5946"/>
+        <w:gridCol w:w="6171"/>
       </w:tblGrid>
       <w:tr>
         <w:trPr>
@@ -9968,7 +9968,7 @@
         </w:tc>
         <w:tc>
           <w:tcPr>
-            <w:tcW w:type="dxa" w:w="5946"/>
+            <w:tcW w:type="dxa" w:w="6171"/>
             <w:tcBorders>
               <w:top w:val="single" w:color="BFBFBF" w:sz="4"/>
               <w:left w:val="single" w:color="BFBFBF" w:sz="4"/>
@@ -10078,7 +10078,7 @@
         </w:tc>
         <w:tc>
           <w:tcPr>
-            <w:tcW w:type="dxa" w:w="5946"/>
+            <w:tcW w:type="dxa" w:w="6171"/>
             <w:tcBorders>
               <w:top w:val="single" w:color="BFBFBF" w:sz="4"/>
               <w:left w:val="single" w:color="BFBFBF" w:sz="4"/>
@@ -10188,7 +10188,7 @@
         </w:tc>
         <w:tc>
           <w:tcPr>
-            <w:tcW w:type="dxa" w:w="5946"/>
+            <w:tcW w:type="dxa" w:w="6171"/>
             <w:tcBorders>
               <w:top w:val="single" w:color="BFBFBF" w:sz="4"/>
               <w:left w:val="single" w:color="BFBFBF" w:sz="4"/>
@@ -10298,7 +10298,7 @@
         </w:tc>
         <w:tc>
           <w:tcPr>
-            <w:tcW w:type="dxa" w:w="5946"/>
+            <w:tcW w:type="dxa" w:w="6171"/>
             <w:tcBorders>
               <w:top w:val="single" w:color="BFBFBF" w:sz="4"/>
               <w:left w:val="single" w:color="BFBFBF" w:sz="4"/>
@@ -10408,7 +10408,7 @@
         </w:tc>
         <w:tc>
           <w:tcPr>
-            <w:tcW w:type="dxa" w:w="5946"/>
+            <w:tcW w:type="dxa" w:w="6171"/>
             <w:tcBorders>
               <w:top w:val="single" w:color="BFBFBF" w:sz="4"/>
               <w:left w:val="single" w:color="BFBFBF" w:sz="4"/>
@@ -10518,7 +10518,7 @@
         </w:tc>
         <w:tc>
           <w:tcPr>
-            <w:tcW w:type="dxa" w:w="5946"/>
+            <w:tcW w:type="dxa" w:w="6171"/>
             <w:tcBorders>
               <w:top w:val="single" w:color="BFBFBF" w:sz="4"/>
               <w:left w:val="single" w:color="BFBFBF" w:sz="4"/>
@@ -10628,7 +10628,7 @@
         </w:tc>
         <w:tc>
           <w:tcPr>
-            <w:tcW w:type="dxa" w:w="5946"/>
+            <w:tcW w:type="dxa" w:w="6171"/>
             <w:tcBorders>
               <w:top w:val="single" w:color="BFBFBF" w:sz="4"/>
               <w:left w:val="single" w:color="BFBFBF" w:sz="4"/>
@@ -10738,7 +10738,7 @@
         </w:tc>
         <w:tc>
           <w:tcPr>
-            <w:tcW w:type="dxa" w:w="5946"/>
+            <w:tcW w:type="dxa" w:w="6171"/>
             <w:tcBorders>
               <w:top w:val="single" w:color="BFBFBF" w:sz="4"/>
               <w:left w:val="single" w:color="BFBFBF" w:sz="4"/>
@@ -10848,7 +10848,7 @@
         </w:tc>
         <w:tc>
           <w:tcPr>
-            <w:tcW w:type="dxa" w:w="5946"/>
+            <w:tcW w:type="dxa" w:w="6171"/>
             <w:tcBorders>
               <w:top w:val="single" w:color="BFBFBF" w:sz="4"/>
               <w:left w:val="single" w:color="BFBFBF" w:sz="4"/>
@@ -10998,7 +10998,7 @@
     </w:p>
     <w:tbl>
       <w:tblPr>
-        <w:tblW w:type="dxa" w:w="8846"/>
+        <w:tblW w:type="dxa" w:w="9071"/>
         <w:tblBorders>
           <w:top w:val="single" w:color="auto" w:sz="4"/>
           <w:left w:val="single" w:color="auto" w:sz="4"/>
@@ -11010,7 +11010,7 @@
       </w:tblPr>
       <w:tblGrid>
         <w:gridCol w:w="3600"/>
-        <w:gridCol w:w="5246"/>
+        <w:gridCol w:w="5471"/>
       </w:tblGrid>
       <w:tr>
         <w:trPr>
@@ -11053,7 +11053,7 @@
         </w:tc>
         <w:tc>
           <w:tcPr>
-            <w:tcW w:type="dxa" w:w="5246"/>
+            <w:tcW w:type="dxa" w:w="5471"/>
             <w:tcBorders>
               <w:top w:val="single" w:color="BFBFBF" w:sz="4"/>
               <w:left w:val="single" w:color="BFBFBF" w:sz="4"/>
@@ -11128,7 +11128,7 @@
         </w:tc>
         <w:tc>
           <w:tcPr>
-            <w:tcW w:type="dxa" w:w="5246"/>
+            <w:tcW w:type="dxa" w:w="5471"/>
             <w:tcBorders>
               <w:top w:val="single" w:color="BFBFBF" w:sz="4"/>
               <w:left w:val="single" w:color="BFBFBF" w:sz="4"/>
@@ -11203,7 +11203,7 @@
         </w:tc>
         <w:tc>
           <w:tcPr>
-            <w:tcW w:type="dxa" w:w="5246"/>
+            <w:tcW w:type="dxa" w:w="5471"/>
             <w:tcBorders>
               <w:top w:val="single" w:color="BFBFBF" w:sz="4"/>
               <w:left w:val="single" w:color="BFBFBF" w:sz="4"/>
@@ -11278,7 +11278,7 @@
         </w:tc>
         <w:tc>
           <w:tcPr>
-            <w:tcW w:type="dxa" w:w="5246"/>
+            <w:tcW w:type="dxa" w:w="5471"/>
             <w:tcBorders>
               <w:top w:val="single" w:color="BFBFBF" w:sz="4"/>
               <w:left w:val="single" w:color="BFBFBF" w:sz="4"/>
@@ -11406,7 +11406,7 @@
     </w:p>
     <w:tbl>
       <w:tblPr>
-        <w:tblW w:type="dxa" w:w="8846"/>
+        <w:tblW w:type="dxa" w:w="9071"/>
         <w:tblBorders>
           <w:top w:val="single" w:color="auto" w:sz="4"/>
           <w:left w:val="single" w:color="auto" w:sz="4"/>
@@ -11419,7 +11419,7 @@
       <w:tblGrid>
         <w:gridCol w:w="2500"/>
         <w:gridCol w:w="1500"/>
-        <w:gridCol w:w="4846"/>
+        <w:gridCol w:w="5071"/>
       </w:tblGrid>
       <w:tr>
         <w:trPr>
@@ -11498,7 +11498,7 @@
         </w:tc>
         <w:tc>
           <w:tcPr>
-            <w:tcW w:type="dxa" w:w="4846"/>
+            <w:tcW w:type="dxa" w:w="5071"/>
             <w:tcBorders>
               <w:top w:val="single" w:color="BFBFBF" w:sz="4"/>
               <w:left w:val="single" w:color="BFBFBF" w:sz="4"/>
@@ -11608,7 +11608,7 @@
         </w:tc>
         <w:tc>
           <w:tcPr>
-            <w:tcW w:type="dxa" w:w="4846"/>
+            <w:tcW w:type="dxa" w:w="5071"/>
             <w:tcBorders>
               <w:top w:val="single" w:color="BFBFBF" w:sz="4"/>
               <w:left w:val="single" w:color="BFBFBF" w:sz="4"/>
@@ -11718,7 +11718,7 @@
         </w:tc>
         <w:tc>
           <w:tcPr>
-            <w:tcW w:type="dxa" w:w="4846"/>
+            <w:tcW w:type="dxa" w:w="5071"/>
             <w:tcBorders>
               <w:top w:val="single" w:color="BFBFBF" w:sz="4"/>
               <w:left w:val="single" w:color="BFBFBF" w:sz="4"/>
@@ -11828,7 +11828,7 @@
         </w:tc>
         <w:tc>
           <w:tcPr>
-            <w:tcW w:type="dxa" w:w="4846"/>
+            <w:tcW w:type="dxa" w:w="5071"/>
             <w:tcBorders>
               <w:top w:val="single" w:color="BFBFBF" w:sz="4"/>
               <w:left w:val="single" w:color="BFBFBF" w:sz="4"/>
@@ -11938,7 +11938,7 @@
         </w:tc>
         <w:tc>
           <w:tcPr>
-            <w:tcW w:type="dxa" w:w="4846"/>
+            <w:tcW w:type="dxa" w:w="5071"/>
             <w:tcBorders>
               <w:top w:val="single" w:color="BFBFBF" w:sz="4"/>
               <w:left w:val="single" w:color="BFBFBF" w:sz="4"/>
@@ -12048,7 +12048,7 @@
         </w:tc>
         <w:tc>
           <w:tcPr>
-            <w:tcW w:type="dxa" w:w="4846"/>
+            <w:tcW w:type="dxa" w:w="5071"/>
             <w:tcBorders>
               <w:top w:val="single" w:color="BFBFBF" w:sz="4"/>
               <w:left w:val="single" w:color="BFBFBF" w:sz="4"/>
@@ -12158,7 +12158,7 @@
         </w:tc>
         <w:tc>
           <w:tcPr>
-            <w:tcW w:type="dxa" w:w="4846"/>
+            <w:tcW w:type="dxa" w:w="5071"/>
             <w:tcBorders>
               <w:top w:val="single" w:color="BFBFBF" w:sz="4"/>
               <w:left w:val="single" w:color="BFBFBF" w:sz="4"/>
@@ -12268,7 +12268,7 @@
         </w:tc>
         <w:tc>
           <w:tcPr>
-            <w:tcW w:type="dxa" w:w="4846"/>
+            <w:tcW w:type="dxa" w:w="5071"/>
             <w:tcBorders>
               <w:top w:val="single" w:color="BFBFBF" w:sz="4"/>
               <w:left w:val="single" w:color="BFBFBF" w:sz="4"/>
@@ -12378,7 +12378,7 @@
         </w:tc>
         <w:tc>
           <w:tcPr>
-            <w:tcW w:type="dxa" w:w="4846"/>
+            <w:tcW w:type="dxa" w:w="5071"/>
             <w:tcBorders>
               <w:top w:val="single" w:color="BFBFBF" w:sz="4"/>
               <w:left w:val="single" w:color="BFBFBF" w:sz="4"/>
@@ -12795,7 +12795,7 @@
     </w:p>
     <w:tbl>
       <w:tblPr>
-        <w:tblW w:type="dxa" w:w="8846"/>
+        <w:tblW w:type="dxa" w:w="9071"/>
         <w:tblBorders>
           <w:top w:val="single" w:color="auto" w:sz="4"/>
           <w:left w:val="single" w:color="auto" w:sz="4"/>
@@ -12808,7 +12808,7 @@
       <w:tblGrid>
         <w:gridCol w:w="2300"/>
         <w:gridCol w:w="1200"/>
-        <w:gridCol w:w="5346"/>
+        <w:gridCol w:w="5571"/>
       </w:tblGrid>
       <w:tr>
         <w:trPr>
@@ -12887,7 +12887,7 @@
         </w:tc>
         <w:tc>
           <w:tcPr>
-            <w:tcW w:type="dxa" w:w="5346"/>
+            <w:tcW w:type="dxa" w:w="5571"/>
             <w:tcBorders>
               <w:top w:val="single" w:color="BFBFBF" w:sz="4"/>
               <w:left w:val="single" w:color="BFBFBF" w:sz="4"/>
@@ -12997,7 +12997,7 @@
         </w:tc>
         <w:tc>
           <w:tcPr>
-            <w:tcW w:type="dxa" w:w="5346"/>
+            <w:tcW w:type="dxa" w:w="5571"/>
             <w:tcBorders>
               <w:top w:val="single" w:color="BFBFBF" w:sz="4"/>
               <w:left w:val="single" w:color="BFBFBF" w:sz="4"/>
@@ -13107,7 +13107,7 @@
         </w:tc>
         <w:tc>
           <w:tcPr>
-            <w:tcW w:type="dxa" w:w="5346"/>
+            <w:tcW w:type="dxa" w:w="5571"/>
             <w:tcBorders>
               <w:top w:val="single" w:color="BFBFBF" w:sz="4"/>
               <w:left w:val="single" w:color="BFBFBF" w:sz="4"/>
@@ -13217,7 +13217,7 @@
         </w:tc>
         <w:tc>
           <w:tcPr>
-            <w:tcW w:type="dxa" w:w="5346"/>
+            <w:tcW w:type="dxa" w:w="5571"/>
             <w:tcBorders>
               <w:top w:val="single" w:color="BFBFBF" w:sz="4"/>
               <w:left w:val="single" w:color="BFBFBF" w:sz="4"/>
@@ -13327,7 +13327,7 @@
         </w:tc>
         <w:tc>
           <w:tcPr>
-            <w:tcW w:type="dxa" w:w="5346"/>
+            <w:tcW w:type="dxa" w:w="5571"/>
             <w:tcBorders>
               <w:top w:val="single" w:color="BFBFBF" w:sz="4"/>
               <w:left w:val="single" w:color="BFBFBF" w:sz="4"/>
@@ -13437,7 +13437,7 @@
         </w:tc>
         <w:tc>
           <w:tcPr>
-            <w:tcW w:type="dxa" w:w="5346"/>
+            <w:tcW w:type="dxa" w:w="5571"/>
             <w:tcBorders>
               <w:top w:val="single" w:color="BFBFBF" w:sz="4"/>
               <w:left w:val="single" w:color="BFBFBF" w:sz="4"/>
@@ -13547,7 +13547,7 @@
         </w:tc>
         <w:tc>
           <w:tcPr>
-            <w:tcW w:type="dxa" w:w="5346"/>
+            <w:tcW w:type="dxa" w:w="5571"/>
             <w:tcBorders>
               <w:top w:val="single" w:color="BFBFBF" w:sz="4"/>
               <w:left w:val="single" w:color="BFBFBF" w:sz="4"/>
@@ -13657,7 +13657,7 @@
         </w:tc>
         <w:tc>
           <w:tcPr>
-            <w:tcW w:type="dxa" w:w="5346"/>
+            <w:tcW w:type="dxa" w:w="5571"/>
             <w:tcBorders>
               <w:top w:val="single" w:color="BFBFBF" w:sz="4"/>
               <w:left w:val="single" w:color="BFBFBF" w:sz="4"/>
@@ -14285,7 +14285,7 @@
     </w:p>
     <w:tbl>
       <w:tblPr>
-        <w:tblW w:type="dxa" w:w="8846"/>
+        <w:tblW w:type="dxa" w:w="9071"/>
         <w:tblBorders>
           <w:top w:val="single" w:color="auto" w:sz="4"/>
           <w:left w:val="single" w:color="auto" w:sz="4"/>
@@ -14298,7 +14298,7 @@
       <w:tblGrid>
         <w:gridCol w:w="600"/>
         <w:gridCol w:w="2700"/>
-        <w:gridCol w:w="5546"/>
+        <w:gridCol w:w="5771"/>
       </w:tblGrid>
       <w:tr>
         <w:trPr>
@@ -14377,7 +14377,7 @@
         </w:tc>
         <w:tc>
           <w:tcPr>
-            <w:tcW w:type="dxa" w:w="5546"/>
+            <w:tcW w:type="dxa" w:w="5771"/>
             <w:tcBorders>
               <w:top w:val="single" w:color="BFBFBF" w:sz="4"/>
               <w:left w:val="single" w:color="BFBFBF" w:sz="4"/>
@@ -14487,7 +14487,7 @@
         </w:tc>
         <w:tc>
           <w:tcPr>
-            <w:tcW w:type="dxa" w:w="5546"/>
+            <w:tcW w:type="dxa" w:w="5771"/>
             <w:tcBorders>
               <w:top w:val="single" w:color="BFBFBF" w:sz="4"/>
               <w:left w:val="single" w:color="BFBFBF" w:sz="4"/>
@@ -14597,7 +14597,7 @@
         </w:tc>
         <w:tc>
           <w:tcPr>
-            <w:tcW w:type="dxa" w:w="5546"/>
+            <w:tcW w:type="dxa" w:w="5771"/>
             <w:tcBorders>
               <w:top w:val="single" w:color="BFBFBF" w:sz="4"/>
               <w:left w:val="single" w:color="BFBFBF" w:sz="4"/>
@@ -14707,7 +14707,7 @@
         </w:tc>
         <w:tc>
           <w:tcPr>
-            <w:tcW w:type="dxa" w:w="5546"/>
+            <w:tcW w:type="dxa" w:w="5771"/>
             <w:tcBorders>
               <w:top w:val="single" w:color="BFBFBF" w:sz="4"/>
               <w:left w:val="single" w:color="BFBFBF" w:sz="4"/>
@@ -14817,7 +14817,7 @@
         </w:tc>
         <w:tc>
           <w:tcPr>
-            <w:tcW w:type="dxa" w:w="5546"/>
+            <w:tcW w:type="dxa" w:w="5771"/>
             <w:tcBorders>
               <w:top w:val="single" w:color="BFBFBF" w:sz="4"/>
               <w:left w:val="single" w:color="BFBFBF" w:sz="4"/>
@@ -14927,7 +14927,7 @@
         </w:tc>
         <w:tc>
           <w:tcPr>
-            <w:tcW w:type="dxa" w:w="5546"/>
+            <w:tcW w:type="dxa" w:w="5771"/>
             <w:tcBorders>
               <w:top w:val="single" w:color="BFBFBF" w:sz="4"/>
               <w:left w:val="single" w:color="BFBFBF" w:sz="4"/>
@@ -14984,7 +14984,7 @@
     </w:p>
     <w:tbl>
       <w:tblPr>
-        <w:tblW w:type="dxa" w:w="8846"/>
+        <w:tblW w:type="dxa" w:w="9071"/>
         <w:tblBorders>
           <w:top w:val="single" w:color="auto" w:sz="4"/>
           <w:left w:val="single" w:color="auto" w:sz="4"/>
@@ -14997,7 +14997,7 @@
       <w:tblGrid>
         <w:gridCol w:w="600"/>
         <w:gridCol w:w="2200"/>
-        <w:gridCol w:w="6046"/>
+        <w:gridCol w:w="6271"/>
       </w:tblGrid>
       <w:tr>
         <w:trPr>
@@ -15076,7 +15076,7 @@
         </w:tc>
         <w:tc>
           <w:tcPr>
-            <w:tcW w:type="dxa" w:w="6046"/>
+            <w:tcW w:type="dxa" w:w="6271"/>
             <w:tcBorders>
               <w:top w:val="single" w:color="BFBFBF" w:sz="4"/>
               <w:left w:val="single" w:color="BFBFBF" w:sz="4"/>
@@ -15186,7 +15186,7 @@
         </w:tc>
         <w:tc>
           <w:tcPr>
-            <w:tcW w:type="dxa" w:w="6046"/>
+            <w:tcW w:type="dxa" w:w="6271"/>
             <w:tcBorders>
               <w:top w:val="single" w:color="BFBFBF" w:sz="4"/>
               <w:left w:val="single" w:color="BFBFBF" w:sz="4"/>
@@ -15296,7 +15296,7 @@
         </w:tc>
         <w:tc>
           <w:tcPr>
-            <w:tcW w:type="dxa" w:w="6046"/>
+            <w:tcW w:type="dxa" w:w="6271"/>
             <w:tcBorders>
               <w:top w:val="single" w:color="BFBFBF" w:sz="4"/>
               <w:left w:val="single" w:color="BFBFBF" w:sz="4"/>
@@ -15406,7 +15406,7 @@
         </w:tc>
         <w:tc>
           <w:tcPr>
-            <w:tcW w:type="dxa" w:w="6046"/>
+            <w:tcW w:type="dxa" w:w="6271"/>
             <w:tcBorders>
               <w:top w:val="single" w:color="BFBFBF" w:sz="4"/>
               <w:left w:val="single" w:color="BFBFBF" w:sz="4"/>
@@ -15516,7 +15516,7 @@
         </w:tc>
         <w:tc>
           <w:tcPr>
-            <w:tcW w:type="dxa" w:w="6046"/>
+            <w:tcW w:type="dxa" w:w="6271"/>
             <w:tcBorders>
               <w:top w:val="single" w:color="BFBFBF" w:sz="4"/>
               <w:left w:val="single" w:color="BFBFBF" w:sz="4"/>
@@ -15626,7 +15626,7 @@
         </w:tc>
         <w:tc>
           <w:tcPr>
-            <w:tcW w:type="dxa" w:w="6046"/>
+            <w:tcW w:type="dxa" w:w="6271"/>
             <w:tcBorders>
               <w:top w:val="single" w:color="BFBFBF" w:sz="4"/>
               <w:left w:val="single" w:color="BFBFBF" w:sz="4"/>
@@ -15736,7 +15736,7 @@
         </w:tc>
         <w:tc>
           <w:tcPr>
-            <w:tcW w:type="dxa" w:w="6046"/>
+            <w:tcW w:type="dxa" w:w="6271"/>
             <w:tcBorders>
               <w:top w:val="single" w:color="BFBFBF" w:sz="4"/>
               <w:left w:val="single" w:color="BFBFBF" w:sz="4"/>
@@ -15914,7 +15914,7 @@
     </w:p>
     <w:tbl>
       <w:tblPr>
-        <w:tblW w:type="dxa" w:w="8846"/>
+        <w:tblW w:type="dxa" w:w="9071"/>
         <w:tblBorders>
           <w:top w:val="single" w:color="auto" w:sz="4"/>
           <w:left w:val="single" w:color="auto" w:sz="4"/>
@@ -15927,7 +15927,7 @@
       <w:tblGrid>
         <w:gridCol w:w="2500"/>
         <w:gridCol w:w="1900"/>
-        <w:gridCol w:w="4446"/>
+        <w:gridCol w:w="4671"/>
       </w:tblGrid>
       <w:tr>
         <w:trPr>
@@ -16006,7 +16006,7 @@
         </w:tc>
         <w:tc>
           <w:tcPr>
-            <w:tcW w:type="dxa" w:w="4446"/>
+            <w:tcW w:type="dxa" w:w="4671"/>
             <w:tcBorders>
               <w:top w:val="single" w:color="BFBFBF" w:sz="4"/>
               <w:left w:val="single" w:color="BFBFBF" w:sz="4"/>
@@ -16116,7 +16116,7 @@
         </w:tc>
         <w:tc>
           <w:tcPr>
-            <w:tcW w:type="dxa" w:w="4446"/>
+            <w:tcW w:type="dxa" w:w="4671"/>
             <w:tcBorders>
               <w:top w:val="single" w:color="BFBFBF" w:sz="4"/>
               <w:left w:val="single" w:color="BFBFBF" w:sz="4"/>
@@ -16226,7 +16226,7 @@
         </w:tc>
         <w:tc>
           <w:tcPr>
-            <w:tcW w:type="dxa" w:w="4446"/>
+            <w:tcW w:type="dxa" w:w="4671"/>
             <w:tcBorders>
               <w:top w:val="single" w:color="BFBFBF" w:sz="4"/>
               <w:left w:val="single" w:color="BFBFBF" w:sz="4"/>
@@ -16336,7 +16336,7 @@
         </w:tc>
         <w:tc>
           <w:tcPr>
-            <w:tcW w:type="dxa" w:w="4446"/>
+            <w:tcW w:type="dxa" w:w="4671"/>
             <w:tcBorders>
               <w:top w:val="single" w:color="BFBFBF" w:sz="4"/>
               <w:left w:val="single" w:color="BFBFBF" w:sz="4"/>
@@ -16446,7 +16446,7 @@
         </w:tc>
         <w:tc>
           <w:tcPr>
-            <w:tcW w:type="dxa" w:w="4446"/>
+            <w:tcW w:type="dxa" w:w="4671"/>
             <w:tcBorders>
               <w:top w:val="single" w:color="BFBFBF" w:sz="4"/>
               <w:left w:val="single" w:color="BFBFBF" w:sz="4"/>
@@ -16556,7 +16556,7 @@
         </w:tc>
         <w:tc>
           <w:tcPr>
-            <w:tcW w:type="dxa" w:w="4446"/>
+            <w:tcW w:type="dxa" w:w="4671"/>
             <w:tcBorders>
               <w:top w:val="single" w:color="BFBFBF" w:sz="4"/>
               <w:left w:val="single" w:color="BFBFBF" w:sz="4"/>
@@ -16666,7 +16666,7 @@
         </w:tc>
         <w:tc>
           <w:tcPr>
-            <w:tcW w:type="dxa" w:w="4446"/>
+            <w:tcW w:type="dxa" w:w="4671"/>
             <w:tcBorders>
               <w:top w:val="single" w:color="BFBFBF" w:sz="4"/>
               <w:left w:val="single" w:color="BFBFBF" w:sz="4"/>
@@ -16751,7 +16751,7 @@
       <w:headerReference w:type="default" r:id="rId7"/>
       <w:footerReference w:type="default" r:id="rId8"/>
       <w:pgSz w:w="11906" w:h="16838" w:orient="portrait"/>
-      <w:pgMar w:top="1440" w:right="1260" w:bottom="1440" w:left="1800" w:header="708" w:footer="708" w:gutter="0"/>
+      <w:pgMar w:top="1134" w:right="1134" w:bottom="1134" w:left="1701" w:header="708" w:footer="708" w:gutter="0"/>
       <w:pgNumType/>
       <w:docGrid w:linePitch="360"/>
     </w:sectPr>

</xml_diff>